<commit_message>
Upated group member list and added gitignore
</commit_message>
<xml_diff>
--- a/results/reports/Preliminary assignment.docx
+++ b/results/reports/Preliminary assignment.docx
@@ -47,6 +47,15 @@
     </w:p>
     <w:sdt>
       <w:sdtPr>
+        <w:rPr>
+          <w:rFonts w:asciiTheme="minorHAnsi" w:eastAsiaTheme="minorHAnsi" w:hAnsiTheme="minorHAnsi" w:cstheme="minorBidi"/>
+          <w:color w:val="auto"/>
+          <w:kern w:val="2"/>
+          <w:sz w:val="24"/>
+          <w:szCs w:val="24"/>
+          <w:lang w:eastAsia="en-US"/>
+          <w14:ligatures w14:val="standardContextual"/>
+        </w:rPr>
         <w:id w:val="-1922406310"/>
         <w:docPartObj>
           <w:docPartGallery w:val="Table of Contents"/>
@@ -55,15 +64,8 @@
       </w:sdtPr>
       <w:sdtEndPr>
         <w:rPr>
-          <w:rFonts w:asciiTheme="minorHAnsi" w:eastAsiaTheme="minorHAnsi" w:hAnsiTheme="minorHAnsi" w:cstheme="minorBidi"/>
           <w:b/>
           <w:bCs/>
-          <w:color w:val="auto"/>
-          <w:kern w:val="2"/>
-          <w:sz w:val="24"/>
-          <w:szCs w:val="24"/>
-          <w:lang w:eastAsia="en-US"/>
-          <w14:ligatures w14:val="standardContextual"/>
         </w:rPr>
       </w:sdtEndPr>
       <w:sdtContent>
@@ -535,13 +537,162 @@
           <w:lang w:val="en-US"/>
         </w:rPr>
       </w:pPr>
-      <w:bookmarkStart w:id="0" w:name="_Toc222910754"/>
-      <w:bookmarkStart w:id="1" w:name="_Toc222910756"/>
+      <w:bookmarkStart w:id="0" w:name="_Toc222910756"/>
+      <w:bookmarkStart w:id="1" w:name="_Toc222910754"/>
       <w:r>
         <w:rPr>
           <w:lang w:val="en-US"/>
         </w:rPr>
         <w:t>Introduction</w:t>
+      </w:r>
+      <w:bookmarkEnd w:id="0"/>
+    </w:p>
+    <w:p>
+      <w:pPr>
+        <w:rPr>
+          <w:lang w:val="en-US"/>
+        </w:rPr>
+      </w:pPr>
+      <w:r>
+        <w:rPr>
+          <w:lang w:val="en-US"/>
+        </w:rPr>
+        <w:t xml:space="preserve">This is the summary for the Projects in Data science preliminary assignment. The summary is uploaded to the </w:t>
+      </w:r>
+      <w:proofErr w:type="spellStart"/>
+      <w:r>
+        <w:rPr>
+          <w:lang w:val="en-US"/>
+        </w:rPr>
+        <w:t>Github</w:t>
+      </w:r>
+      <w:proofErr w:type="spellEnd"/>
+      <w:r>
+        <w:rPr>
+          <w:lang w:val="en-US"/>
+        </w:rPr>
+        <w:t xml:space="preserve"> repository linked above and has the following path:</w:t>
+      </w:r>
+    </w:p>
+    <w:p>
+      <w:pPr>
+        <w:rPr>
+          <w:lang w:val="en-US"/>
+        </w:rPr>
+      </w:pPr>
+      <w:r>
+        <w:rPr>
+          <w:lang w:val="en-US"/>
+        </w:rPr>
+        <w:t>results/reports/</w:t>
+      </w:r>
+    </w:p>
+    <w:p>
+      <w:pPr>
+        <w:rPr>
+          <w:lang w:val="en-US"/>
+        </w:rPr>
+      </w:pPr>
+      <w:r>
+        <w:rPr>
+          <w:lang w:val="en-US"/>
+        </w:rPr>
+        <w:t xml:space="preserve">The group members </w:t>
+      </w:r>
+      <w:proofErr w:type="gramStart"/>
+      <w:r>
+        <w:rPr>
+          <w:lang w:val="en-US"/>
+        </w:rPr>
+        <w:t>is</w:t>
+      </w:r>
+      <w:proofErr w:type="gramEnd"/>
+      <w:r>
+        <w:rPr>
+          <w:lang w:val="en-US"/>
+        </w:rPr>
+        <w:t xml:space="preserve"> listed in the “Group members” section and has the following information:</w:t>
+      </w:r>
+    </w:p>
+    <w:p>
+      <w:pPr>
+        <w:rPr>
+          <w:lang w:val="en-US"/>
+        </w:rPr>
+      </w:pPr>
+      <w:r>
+        <w:rPr>
+          <w:lang w:val="en-US"/>
+        </w:rPr>
+        <w:t xml:space="preserve">Name - </w:t>
+      </w:r>
+      <w:proofErr w:type="spellStart"/>
+      <w:r>
+        <w:rPr>
+          <w:lang w:val="en-US"/>
+        </w:rPr>
+        <w:t>Github</w:t>
+      </w:r>
+      <w:proofErr w:type="spellEnd"/>
+      <w:r>
+        <w:rPr>
+          <w:lang w:val="en-US"/>
+        </w:rPr>
+        <w:t xml:space="preserve"> username - Annotator nr</w:t>
+      </w:r>
+    </w:p>
+    <w:p>
+      <w:pPr>
+        <w:rPr>
+          <w:lang w:val="en-US"/>
+        </w:rPr>
+      </w:pPr>
+      <w:r>
+        <w:rPr>
+          <w:lang w:val="en-US"/>
+        </w:rPr>
+        <w:t xml:space="preserve">The annotations </w:t>
+      </w:r>
+      <w:proofErr w:type="gramStart"/>
+      <w:r>
+        <w:rPr>
+          <w:lang w:val="en-US"/>
+        </w:rPr>
+        <w:t>is</w:t>
+      </w:r>
+      <w:proofErr w:type="gramEnd"/>
+      <w:r>
+        <w:rPr>
+          <w:lang w:val="en-US"/>
+        </w:rPr>
+        <w:t xml:space="preserve"> done in “features_GroupL.csv” with same path as the summary. The column names are as an example: Hair_1, Hair_2, Mark_1, Mark_2. Where “Hair” and “Mark” tells what is annotated and the number represents the number of the annotator.</w:t>
+      </w:r>
+    </w:p>
+    <w:p>
+      <w:pPr>
+        <w:rPr>
+          <w:lang w:val="en-US"/>
+        </w:rPr>
+      </w:pPr>
+      <w:r>
+        <w:rPr>
+          <w:lang w:val="en-US"/>
+        </w:rPr>
+        <w:t>The summary contains a small analysis of the group data .csv file and the annotations.</w:t>
+      </w:r>
+    </w:p>
+    <w:p>
+      <w:pPr>
+        <w:pStyle w:val="Overskrift1"/>
+        <w:rPr>
+          <w:lang w:val="en-US"/>
+        </w:rPr>
+      </w:pPr>
+      <w:r>
+        <w:rPr>
+          <w:lang w:val="en-US"/>
+        </w:rPr>
+        <w:t>Group members</w:t>
       </w:r>
       <w:bookmarkEnd w:id="1"/>
     </w:p>
@@ -555,7 +706,21 @@
         <w:rPr>
           <w:lang w:val="en-US"/>
         </w:rPr>
-        <w:t>This is the summary for the Projects in Data science preliminary assignment. The summary is uploaded to the Github repository linked above and has the following path:</w:t>
+        <w:t xml:space="preserve">Jadbinder Singh Toor - </w:t>
+      </w:r>
+      <w:proofErr w:type="spellStart"/>
+      <w:r>
+        <w:rPr>
+          <w:lang w:val="en-US"/>
+        </w:rPr>
+        <w:t>jadt</w:t>
+      </w:r>
+      <w:proofErr w:type="spellEnd"/>
+      <w:r>
+        <w:rPr>
+          <w:lang w:val="en-US"/>
+        </w:rPr>
+        <w:t xml:space="preserve"> - Annotator nr. 1</w:t>
       </w:r>
     </w:p>
     <w:p>
@@ -568,65 +733,33 @@
         <w:rPr>
           <w:lang w:val="en-US"/>
         </w:rPr>
-        <w:t>results/reports/</w:t>
-      </w:r>
-    </w:p>
-    <w:p>
-      <w:pPr>
-        <w:rPr>
-          <w:lang w:val="en-US"/>
-        </w:rPr>
-      </w:pPr>
-      <w:r>
-        <w:rPr>
-          <w:lang w:val="en-US"/>
-        </w:rPr>
-        <w:t>The group members</w:t>
-      </w:r>
-      <w:r>
-        <w:rPr>
-          <w:lang w:val="en-US"/>
-        </w:rPr>
-        <w:t xml:space="preserve"> is listed in the “Group members” section and has the following information:</w:t>
-      </w:r>
-    </w:p>
-    <w:p>
-      <w:pPr>
-        <w:rPr>
-          <w:lang w:val="en-US"/>
-        </w:rPr>
-      </w:pPr>
-      <w:r>
-        <w:rPr>
-          <w:lang w:val="en-US"/>
-        </w:rPr>
-        <w:t>Name - Github username - Annotator nr</w:t>
-      </w:r>
-    </w:p>
-    <w:p>
-      <w:pPr>
-        <w:rPr>
-          <w:lang w:val="en-US"/>
-        </w:rPr>
-      </w:pPr>
-      <w:r>
-        <w:rPr>
-          <w:lang w:val="en-US"/>
-        </w:rPr>
-        <w:t>The annotations is done in “features_GroupL.csv” with same path as the summary. The column names are as an example: Hair_1, Hair_2, Mark_1, Mark_2. Where “Hair” and “Mark” tells what is annotated and the number represents the number of the annotator.</w:t>
-      </w:r>
-    </w:p>
-    <w:p>
-      <w:pPr>
-        <w:rPr>
-          <w:lang w:val="en-US"/>
-        </w:rPr>
-      </w:pPr>
-      <w:r>
-        <w:rPr>
-          <w:lang w:val="en-US"/>
-        </w:rPr>
-        <w:t>The summary contains a small analysis of the group data .csv file and the annotations.</w:t>
+        <w:t xml:space="preserve">Julian David Forsmann - </w:t>
+      </w:r>
+      <w:proofErr w:type="spellStart"/>
+      <w:r>
+        <w:rPr>
+          <w:lang w:val="en-US"/>
+        </w:rPr>
+        <w:t>jufoDS</w:t>
+      </w:r>
+      <w:proofErr w:type="spellEnd"/>
+      <w:r>
+        <w:rPr>
+          <w:lang w:val="en-US"/>
+        </w:rPr>
+        <w:t xml:space="preserve"> - Annotator nr</w:t>
+      </w:r>
+      <w:r>
+        <w:rPr>
+          <w:lang w:val="en-US"/>
+        </w:rPr>
+        <w:t>.</w:t>
+      </w:r>
+      <w:r>
+        <w:rPr>
+          <w:lang w:val="en-US"/>
+        </w:rPr>
+        <w:t xml:space="preserve"> 3</w:t>
       </w:r>
     </w:p>
     <w:p>
@@ -636,40 +769,27 @@
           <w:lang w:val="en-US"/>
         </w:rPr>
       </w:pPr>
-      <w:r>
-        <w:rPr>
-          <w:lang w:val="en-US"/>
-        </w:rPr>
-        <w:t>Group members</w:t>
-      </w:r>
-      <w:bookmarkEnd w:id="0"/>
-    </w:p>
-    <w:p>
-      <w:pPr>
-        <w:rPr>
-          <w:lang w:val="en-US"/>
-        </w:rPr>
-      </w:pPr>
-      <w:r>
-        <w:rPr>
-          <w:lang w:val="en-US"/>
-        </w:rPr>
-        <w:t>Julian David Forsmann - jufoDS - Annotator nr 3</w:t>
-      </w:r>
-    </w:p>
-    <w:p>
-      <w:pPr>
-        <w:pStyle w:val="Overskrift1"/>
-        <w:rPr>
-          <w:lang w:val="en-US"/>
-        </w:rPr>
-      </w:pPr>
       <w:bookmarkStart w:id="2" w:name="_Toc222910755"/>
       <w:r>
         <w:rPr>
           <w:lang w:val="en-US"/>
         </w:rPr>
-        <w:t>Link to Github repository</w:t>
+        <w:lastRenderedPageBreak/>
+        <w:t xml:space="preserve">Link to </w:t>
+      </w:r>
+      <w:proofErr w:type="spellStart"/>
+      <w:r>
+        <w:rPr>
+          <w:lang w:val="en-US"/>
+        </w:rPr>
+        <w:t>Github</w:t>
+      </w:r>
+      <w:proofErr w:type="spellEnd"/>
+      <w:r>
+        <w:rPr>
+          <w:lang w:val="en-US"/>
+        </w:rPr>
+        <w:t xml:space="preserve"> repository</w:t>
       </w:r>
       <w:bookmarkEnd w:id="2"/>
     </w:p>
@@ -685,21 +805,7 @@
             <w:rStyle w:val="Hyperlink"/>
             <w:lang w:val="en-US"/>
           </w:rPr>
-          <w:t>https://github.com/JSToor</w:t>
-        </w:r>
-        <w:r>
-          <w:rPr>
-            <w:rStyle w:val="Hyperlink"/>
-            <w:lang w:val="en-US"/>
-          </w:rPr>
-          <w:t>1</w:t>
-        </w:r>
-        <w:r>
-          <w:rPr>
-            <w:rStyle w:val="Hyperlink"/>
-            <w:lang w:val="en-US"/>
-          </w:rPr>
-          <w:t>3/2026-PDS-GroupL</w:t>
+          <w:t>https://github.com/JSToor13/2026-PDS-GroupL</w:t>
         </w:r>
       </w:hyperlink>
     </w:p>

</xml_diff>

<commit_message>
Analysis of distribution of cancers and by gender + example of disagreements
</commit_message>
<xml_diff>
--- a/results/reports/Preliminary assignment.docx
+++ b/results/reports/Preliminary assignment.docx
@@ -1,6 +1,6 @@
 
 <file path=word/document.xml><?xml version="1.0" encoding="utf-8"?>
-<w:document xmlns:wpc="http://schemas.microsoft.com/office/word/2010/wordprocessingCanvas" xmlns:cx="http://schemas.microsoft.com/office/drawing/2014/chartex" xmlns:cx1="http://schemas.microsoft.com/office/drawing/2015/9/8/chartex" xmlns:cx2="http://schemas.microsoft.com/office/drawing/2015/10/21/chartex" xmlns:cx3="http://schemas.microsoft.com/office/drawing/2016/5/9/chartex" xmlns:cx4="http://schemas.microsoft.com/office/drawing/2016/5/10/chartex" xmlns:cx5="http://schemas.microsoft.com/office/drawing/2016/5/11/chartex" xmlns:cx6="http://schemas.microsoft.com/office/drawing/2016/5/12/chartex" xmlns:cx7="http://schemas.microsoft.com/office/drawing/2016/5/13/chartex" xmlns:cx8="http://schemas.microsoft.com/office/drawing/2016/5/14/chartex" xmlns:mc="http://schemas.openxmlformats.org/markup-compatibility/2006" xmlns:aink="http://schemas.microsoft.com/office/drawing/2016/ink" xmlns:am3d="http://schemas.microsoft.com/office/drawing/2017/model3d" xmlns:o="urn:schemas-microsoft-com:office:office" xmlns:oel="http://schemas.microsoft.com/office/2019/extlst" xmlns:r="http://schemas.openxmlformats.org/officeDocument/2006/relationships" xmlns:m="http://schemas.openxmlformats.org/officeDocument/2006/math" xmlns:v="urn:schemas-microsoft-com:vml" xmlns:wp14="http://schemas.microsoft.com/office/word/2010/wordprocessingDrawing" xmlns:wp="http://schemas.openxmlformats.org/drawingml/2006/wordprocessingDrawing" xmlns:w10="urn:schemas-microsoft-com:office:word" xmlns:w="http://schemas.openxmlformats.org/wordprocessingml/2006/main" xmlns:w14="http://schemas.microsoft.com/office/word/2010/wordml" xmlns:w15="http://schemas.microsoft.com/office/word/2012/wordml" xmlns:w16cex="http://schemas.microsoft.com/office/word/2018/wordml/cex" xmlns:w16cid="http://schemas.microsoft.com/office/word/2016/wordml/cid" xmlns:w16="http://schemas.microsoft.com/office/word/2018/wordml" xmlns:w16du="http://schemas.microsoft.com/office/word/2023/wordml/word16du" xmlns:w16sdtdh="http://schemas.microsoft.com/office/word/2020/wordml/sdtdatahash" xmlns:w16sdtfl="http://schemas.microsoft.com/office/word/2024/wordml/sdtformatlock" xmlns:w16se="http://schemas.microsoft.com/office/word/2015/wordml/symex" xmlns:wpg="http://schemas.microsoft.com/office/word/2010/wordprocessingGroup" xmlns:wpi="http://schemas.microsoft.com/office/word/2010/wordprocessingInk" xmlns:wne="http://schemas.microsoft.com/office/word/2006/wordml" xmlns:wps="http://schemas.microsoft.com/office/word/2010/wordprocessingShape" mc:Ignorable="w14 w15 w16se w16cid w16 w16cex w16sdtdh w16sdtfl w16du wp14">
+<w:document xmlns:wpc="http://schemas.microsoft.com/office/word/2010/wordprocessingCanvas" xmlns:cx="http://schemas.microsoft.com/office/drawing/2014/chartex" xmlns:cx1="http://schemas.microsoft.com/office/drawing/2015/9/8/chartex" xmlns:cx2="http://schemas.microsoft.com/office/drawing/2015/10/21/chartex" xmlns:cx3="http://schemas.microsoft.com/office/drawing/2016/5/9/chartex" xmlns:cx4="http://schemas.microsoft.com/office/drawing/2016/5/10/chartex" xmlns:cx5="http://schemas.microsoft.com/office/drawing/2016/5/11/chartex" xmlns:cx6="http://schemas.microsoft.com/office/drawing/2016/5/12/chartex" xmlns:cx7="http://schemas.microsoft.com/office/drawing/2016/5/13/chartex" xmlns:cx8="http://schemas.microsoft.com/office/drawing/2016/5/14/chartex" xmlns:mc="http://schemas.openxmlformats.org/markup-compatibility/2006" xmlns:aink="http://schemas.microsoft.com/office/drawing/2016/ink" xmlns:am3d="http://schemas.microsoft.com/office/drawing/2017/model3d" xmlns:o="urn:schemas-microsoft-com:office:office" xmlns:oel="http://schemas.microsoft.com/office/2019/extlst" xmlns:r="http://schemas.openxmlformats.org/officeDocument/2006/relationships" xmlns:m="http://schemas.openxmlformats.org/officeDocument/2006/math" xmlns:v="urn:schemas-microsoft-com:vml" xmlns:wp14="http://schemas.microsoft.com/office/word/2010/wordprocessingDrawing" xmlns:wp="http://schemas.openxmlformats.org/drawingml/2006/wordprocessingDrawing" xmlns:w10="urn:schemas-microsoft-com:office:word" xmlns:w="http://schemas.openxmlformats.org/wordprocessingml/2006/main" xmlns:w14="http://schemas.microsoft.com/office/word/2010/wordml" xmlns:w15="http://schemas.microsoft.com/office/word/2012/wordml" xmlns:w16cex="http://schemas.microsoft.com/office/word/2018/wordml/cex" xmlns:w16cid="http://schemas.microsoft.com/office/word/2016/wordml/cid" xmlns:w16="http://schemas.microsoft.com/office/word/2018/wordml" xmlns:w16du="http://schemas.microsoft.com/office/word/2023/wordml/word16du" xmlns:w16sdtdh="http://schemas.microsoft.com/office/word/2020/wordml/sdtdatahash" xmlns:w16se="http://schemas.microsoft.com/office/word/2015/wordml/symex" xmlns:wpg="http://schemas.microsoft.com/office/word/2010/wordprocessingGroup" xmlns:wpi="http://schemas.microsoft.com/office/word/2010/wordprocessingInk" xmlns:wne="http://schemas.microsoft.com/office/word/2006/wordml" xmlns:wps="http://schemas.microsoft.com/office/word/2010/wordprocessingShape" mc:Ignorable="w14 w15 w16se w16cid w16 w16cex w16sdtdh w16du wp14">
   <w:body>
     <w:p>
       <w:pPr>
@@ -73,8 +73,13 @@
           <w:pPr>
             <w:pStyle w:val="Overskrift"/>
           </w:pPr>
+          <w:proofErr w:type="spellStart"/>
           <w:r>
-            <w:t>Indhold</w:t>
+            <w:t>Table</w:t>
+          </w:r>
+          <w:proofErr w:type="spellEnd"/>
+          <w:r>
+            <w:t xml:space="preserve"> of contents</w:t>
           </w:r>
         </w:p>
         <w:p>
@@ -98,14 +103,14 @@
           <w:r>
             <w:fldChar w:fldCharType="separate"/>
           </w:r>
-          <w:hyperlink w:anchor="_Toc222910754" w:history="1">
+          <w:hyperlink w:anchor="_Toc222916580" w:history="1">
             <w:r>
               <w:rPr>
                 <w:rStyle w:val="Hyperlink"/>
                 <w:noProof/>
                 <w:lang w:val="en-US"/>
               </w:rPr>
-              <w:t>Group members</w:t>
+              <w:t>Introduction</w:t>
             </w:r>
             <w:r>
               <w:rPr>
@@ -126,7 +131,7 @@
                 <w:noProof/>
                 <w:webHidden/>
               </w:rPr>
-              <w:instrText xml:space="preserve"> PAGEREF _Toc222910754 \h </w:instrText>
+              <w:instrText xml:space="preserve"> PAGEREF _Toc222916580 \h </w:instrText>
             </w:r>
             <w:r>
               <w:rPr>
@@ -169,14 +174,14 @@
               <w:lang w:eastAsia="da-DK"/>
             </w:rPr>
           </w:pPr>
-          <w:hyperlink w:anchor="_Toc222910755" w:history="1">
+          <w:hyperlink w:anchor="_Toc222916581" w:history="1">
             <w:r>
               <w:rPr>
                 <w:rStyle w:val="Hyperlink"/>
                 <w:noProof/>
                 <w:lang w:val="en-US"/>
               </w:rPr>
-              <w:t>Link to Github repository</w:t>
+              <w:t>Group members</w:t>
             </w:r>
             <w:r>
               <w:rPr>
@@ -197,7 +202,7 @@
                 <w:noProof/>
                 <w:webHidden/>
               </w:rPr>
-              <w:instrText xml:space="preserve"> PAGEREF _Toc222910755 \h </w:instrText>
+              <w:instrText xml:space="preserve"> PAGEREF _Toc222916581 \h </w:instrText>
             </w:r>
             <w:r>
               <w:rPr>
@@ -240,14 +245,14 @@
               <w:lang w:eastAsia="da-DK"/>
             </w:rPr>
           </w:pPr>
-          <w:hyperlink w:anchor="_Toc222910756" w:history="1">
+          <w:hyperlink w:anchor="_Toc222916582" w:history="1">
             <w:r>
               <w:rPr>
                 <w:rStyle w:val="Hyperlink"/>
                 <w:noProof/>
                 <w:lang w:val="en-US"/>
               </w:rPr>
-              <w:t>Introduction</w:t>
+              <w:t>Link to Github repository</w:t>
             </w:r>
             <w:r>
               <w:rPr>
@@ -268,7 +273,7 @@
                 <w:noProof/>
                 <w:webHidden/>
               </w:rPr>
-              <w:instrText xml:space="preserve"> PAGEREF _Toc222910756 \h </w:instrText>
+              <w:instrText xml:space="preserve"> PAGEREF _Toc222916582 \h </w:instrText>
             </w:r>
             <w:r>
               <w:rPr>
@@ -288,7 +293,7 @@
                 <w:noProof/>
                 <w:webHidden/>
               </w:rPr>
-              <w:t>1</w:t>
+              <w:t>2</w:t>
             </w:r>
             <w:r>
               <w:rPr>
@@ -311,7 +316,7 @@
               <w:lang w:eastAsia="da-DK"/>
             </w:rPr>
           </w:pPr>
-          <w:hyperlink w:anchor="_Toc222910757" w:history="1">
+          <w:hyperlink w:anchor="_Toc222916583" w:history="1">
             <w:r>
               <w:rPr>
                 <w:rStyle w:val="Hyperlink"/>
@@ -339,7 +344,7 @@
                 <w:noProof/>
                 <w:webHidden/>
               </w:rPr>
-              <w:instrText xml:space="preserve"> PAGEREF _Toc222910757 \h </w:instrText>
+              <w:instrText xml:space="preserve"> PAGEREF _Toc222916583 \h </w:instrText>
             </w:r>
             <w:r>
               <w:rPr>
@@ -359,7 +364,7 @@
                 <w:noProof/>
                 <w:webHidden/>
               </w:rPr>
-              <w:t>1</w:t>
+              <w:t>2</w:t>
             </w:r>
             <w:r>
               <w:rPr>
@@ -382,14 +387,14 @@
               <w:lang w:eastAsia="da-DK"/>
             </w:rPr>
           </w:pPr>
-          <w:hyperlink w:anchor="_Toc222910758" w:history="1">
+          <w:hyperlink w:anchor="_Toc222916584" w:history="1">
             <w:r>
               <w:rPr>
                 <w:rStyle w:val="Hyperlink"/>
                 <w:noProof/>
                 <w:lang w:val="en-US"/>
               </w:rPr>
-              <w:t>Analysis of csv file</w:t>
+              <w:t>Analysis of group data .csv file</w:t>
             </w:r>
             <w:r>
               <w:rPr>
@@ -410,7 +415,7 @@
                 <w:noProof/>
                 <w:webHidden/>
               </w:rPr>
-              <w:instrText xml:space="preserve"> PAGEREF _Toc222910758 \h </w:instrText>
+              <w:instrText xml:space="preserve"> PAGEREF _Toc222916584 \h </w:instrText>
             </w:r>
             <w:r>
               <w:rPr>
@@ -430,7 +435,7 @@
                 <w:noProof/>
                 <w:webHidden/>
               </w:rPr>
-              <w:t>1</w:t>
+              <w:t>2</w:t>
             </w:r>
             <w:r>
               <w:rPr>
@@ -453,7 +458,7 @@
               <w:lang w:eastAsia="da-DK"/>
             </w:rPr>
           </w:pPr>
-          <w:hyperlink w:anchor="_Toc222910759" w:history="1">
+          <w:hyperlink w:anchor="_Toc222916585" w:history="1">
             <w:r>
               <w:rPr>
                 <w:rStyle w:val="Hyperlink"/>
@@ -481,7 +486,7 @@
                 <w:noProof/>
                 <w:webHidden/>
               </w:rPr>
-              <w:instrText xml:space="preserve"> PAGEREF _Toc222910759 \h </w:instrText>
+              <w:instrText xml:space="preserve"> PAGEREF _Toc222916585 \h </w:instrText>
             </w:r>
             <w:r>
               <w:rPr>
@@ -501,7 +506,7 @@
                 <w:noProof/>
                 <w:webHidden/>
               </w:rPr>
-              <w:t>2</w:t>
+              <w:t>3</w:t>
             </w:r>
             <w:r>
               <w:rPr>
@@ -537,8 +542,7 @@
           <w:lang w:val="en-US"/>
         </w:rPr>
       </w:pPr>
-      <w:bookmarkStart w:id="0" w:name="_Toc222910756"/>
-      <w:bookmarkStart w:id="1" w:name="_Toc222910754"/>
+      <w:bookmarkStart w:id="0" w:name="_Toc222916580"/>
       <w:r>
         <w:rPr>
           <w:lang w:val="en-US"/>
@@ -688,6 +692,7 @@
           <w:lang w:val="en-US"/>
         </w:rPr>
       </w:pPr>
+      <w:bookmarkStart w:id="1" w:name="_Toc222916581"/>
       <w:r>
         <w:rPr>
           <w:lang w:val="en-US"/>
@@ -708,19 +713,44 @@
         </w:rPr>
         <w:t xml:space="preserve">Jadbinder Singh Toor - </w:t>
       </w:r>
+      <w:r>
+        <w:rPr>
+          <w:lang w:val="en-US"/>
+        </w:rPr>
+        <w:t>JSToor13</w:t>
+      </w:r>
+      <w:r>
+        <w:rPr>
+          <w:lang w:val="en-US"/>
+        </w:rPr>
+        <w:t xml:space="preserve"> - Annotator nr. 1</w:t>
+      </w:r>
+    </w:p>
+    <w:p>
+      <w:pPr>
+        <w:rPr>
+          <w:lang w:val="en-US"/>
+        </w:rPr>
+      </w:pPr>
+      <w:r>
+        <w:rPr>
+          <w:lang w:val="en-US"/>
+        </w:rPr>
+        <w:t xml:space="preserve">Helena Christine Hansen - </w:t>
+      </w:r>
       <w:proofErr w:type="spellStart"/>
       <w:r>
         <w:rPr>
           <w:lang w:val="en-US"/>
         </w:rPr>
-        <w:t>jadt</w:t>
+        <w:t>Helanae</w:t>
       </w:r>
       <w:proofErr w:type="spellEnd"/>
       <w:r>
         <w:rPr>
           <w:lang w:val="en-US"/>
         </w:rPr>
-        <w:t xml:space="preserve"> - Annotator nr. 1</w:t>
+        <w:t xml:space="preserve"> - Annotator nr. 2</w:t>
       </w:r>
     </w:p>
     <w:p>
@@ -740,7 +770,7 @@
         <w:rPr>
           <w:lang w:val="en-US"/>
         </w:rPr>
-        <w:t>jufoDS</w:t>
+        <w:t>somerhowginger</w:t>
       </w:r>
       <w:proofErr w:type="spellEnd"/>
       <w:r>
@@ -769,7 +799,7 @@
           <w:lang w:val="en-US"/>
         </w:rPr>
       </w:pPr>
-      <w:bookmarkStart w:id="2" w:name="_Toc222910755"/>
+      <w:bookmarkStart w:id="2" w:name="_Toc222916582"/>
       <w:r>
         <w:rPr>
           <w:lang w:val="en-US"/>
@@ -823,7 +853,7 @@
           <w:lang w:val="en-US"/>
         </w:rPr>
       </w:pPr>
-      <w:bookmarkStart w:id="3" w:name="_Toc222910757"/>
+      <w:bookmarkStart w:id="3" w:name="_Toc222916583"/>
       <w:r>
         <w:rPr>
           <w:lang w:val="en-US"/>
@@ -839,7 +869,7 @@
           <w:lang w:val="en-US"/>
         </w:rPr>
       </w:pPr>
-      <w:bookmarkStart w:id="4" w:name="_Toc222910758"/>
+      <w:bookmarkStart w:id="4" w:name="_Toc222916584"/>
       <w:r>
         <w:rPr>
           <w:lang w:val="en-US"/>
@@ -862,12 +892,205 @@
     </w:p>
     <w:p>
       <w:pPr>
+        <w:rPr>
+          <w:lang w:val="en-US"/>
+        </w:rPr>
+      </w:pPr>
+      <w:r>
+        <w:rPr>
+          <w:lang w:val="en-US"/>
+        </w:rPr>
+        <w:t>In our group data, we can see that there is a big difference between the frequencies of each type of cancer. Cancers like MEL are very rare compared to cancers like BCC.</w:t>
+      </w:r>
+      <w:r>
+        <w:rPr>
+          <w:lang w:val="en-US"/>
+        </w:rPr>
+        <w:t xml:space="preserve"> The distribution of cancers can be seen below.</w:t>
+      </w:r>
+    </w:p>
+    <w:p>
+      <w:pPr>
+        <w:rPr>
+          <w:lang w:val="en-US"/>
+        </w:rPr>
+      </w:pPr>
+      <w:r>
+        <w:rPr>
+          <w:lang w:val="en-US"/>
+        </w:rPr>
+        <w:drawing>
+          <wp:inline distT="0" distB="0" distL="0" distR="0" wp14:anchorId="3AA16842" wp14:editId="1D5D725D">
+            <wp:extent cx="4343400" cy="2145715"/>
+            <wp:effectExtent l="0" t="0" r="0" b="6985"/>
+            <wp:docPr id="2029434403" name="Billede 1" descr="Et billede, der indeholder tekst, skærmbillede, Kurve, diagram&#10;&#10;Automatisk genereret beskrivelse"/>
+            <wp:cNvGraphicFramePr>
+              <a:graphicFrameLocks xmlns:a="http://schemas.openxmlformats.org/drawingml/2006/main" noChangeAspect="1"/>
+            </wp:cNvGraphicFramePr>
+            <a:graphic xmlns:a="http://schemas.openxmlformats.org/drawingml/2006/main">
+              <a:graphicData uri="http://schemas.openxmlformats.org/drawingml/2006/picture">
+                <pic:pic xmlns:pic="http://schemas.openxmlformats.org/drawingml/2006/picture">
+                  <pic:nvPicPr>
+                    <pic:cNvPr id="2029434403" name="Billede 1" descr="Et billede, der indeholder tekst, skærmbillede, Kurve, diagram&#10;&#10;Automatisk genereret beskrivelse"/>
+                    <pic:cNvPicPr/>
+                  </pic:nvPicPr>
+                  <pic:blipFill>
+                    <a:blip r:embed="rId6"/>
+                    <a:stretch>
+                      <a:fillRect/>
+                    </a:stretch>
+                  </pic:blipFill>
+                  <pic:spPr>
+                    <a:xfrm>
+                      <a:off x="0" y="0"/>
+                      <a:ext cx="4352570" cy="2150245"/>
+                    </a:xfrm>
+                    <a:prstGeom prst="rect">
+                      <a:avLst/>
+                    </a:prstGeom>
+                  </pic:spPr>
+                </pic:pic>
+              </a:graphicData>
+            </a:graphic>
+          </wp:inline>
+        </w:drawing>
+      </w:r>
+    </w:p>
+    <w:p>
+      <w:pPr>
+        <w:rPr>
+          <w:lang w:val="en-US"/>
+        </w:rPr>
+      </w:pPr>
+      <w:r>
+        <w:rPr>
+          <w:lang w:val="en-US"/>
+        </w:rPr>
+        <w:t>As for the distribution of cancer types by gender, which can be seen below, there is small differences between the genders such as there being more women with BCC and SCC and there only being men with MEL and NEV. However, with such a small sample size small discrepancies like these are to be expected. Especially when considering the next point.</w:t>
+      </w:r>
+    </w:p>
+    <w:p>
+      <w:pPr>
+        <w:rPr>
+          <w:lang w:val="en-US"/>
+        </w:rPr>
+      </w:pPr>
+      <w:r>
+        <w:rPr>
+          <w:lang w:val="en-US"/>
+        </w:rPr>
+        <w:drawing>
+          <wp:inline distT="0" distB="0" distL="0" distR="0" wp14:anchorId="01354E0C" wp14:editId="74FFD2C3">
+            <wp:extent cx="3686689" cy="2238687"/>
+            <wp:effectExtent l="0" t="0" r="9525" b="9525"/>
+            <wp:docPr id="1638873855" name="Billede 1" descr="Et billede, der indeholder tekst, diagram, Kurve, linje/række&#10;&#10;Automatisk genereret beskrivelse"/>
+            <wp:cNvGraphicFramePr>
+              <a:graphicFrameLocks xmlns:a="http://schemas.openxmlformats.org/drawingml/2006/main" noChangeAspect="1"/>
+            </wp:cNvGraphicFramePr>
+            <a:graphic xmlns:a="http://schemas.openxmlformats.org/drawingml/2006/main">
+              <a:graphicData uri="http://schemas.openxmlformats.org/drawingml/2006/picture">
+                <pic:pic xmlns:pic="http://schemas.openxmlformats.org/drawingml/2006/picture">
+                  <pic:nvPicPr>
+                    <pic:cNvPr id="1638873855" name="Billede 1" descr="Et billede, der indeholder tekst, diagram, Kurve, linje/række&#10;&#10;Automatisk genereret beskrivelse"/>
+                    <pic:cNvPicPr/>
+                  </pic:nvPicPr>
+                  <pic:blipFill>
+                    <a:blip r:embed="rId7"/>
+                    <a:stretch>
+                      <a:fillRect/>
+                    </a:stretch>
+                  </pic:blipFill>
+                  <pic:spPr>
+                    <a:xfrm>
+                      <a:off x="0" y="0"/>
+                      <a:ext cx="3686689" cy="2238687"/>
+                    </a:xfrm>
+                    <a:prstGeom prst="rect">
+                      <a:avLst/>
+                    </a:prstGeom>
+                  </pic:spPr>
+                </pic:pic>
+              </a:graphicData>
+            </a:graphic>
+          </wp:inline>
+        </w:drawing>
+      </w:r>
+    </w:p>
+    <w:p>
+      <w:pPr>
+        <w:rPr>
+          <w:lang w:val="en-US"/>
+        </w:rPr>
+      </w:pPr>
+      <w:r>
+        <w:rPr>
+          <w:lang w:val="en-US"/>
+        </w:rPr>
+        <w:lastRenderedPageBreak/>
+        <w:t>One thing we did notice when comparing the image of distribution of cancer types to the diagnostic distribution by gender,</w:t>
+      </w:r>
+      <w:r>
+        <w:rPr>
+          <w:lang w:val="en-US"/>
+        </w:rPr>
+        <w:t xml:space="preserve"> </w:t>
+      </w:r>
+      <w:r>
+        <w:rPr>
+          <w:lang w:val="en-US"/>
+        </w:rPr>
+        <w:t xml:space="preserve">is that the gendered numbers did not add up to the total amount of people with that diagnosis, especially in the diagnoses NEV and SEK. We then found out it was because </w:t>
+      </w:r>
+      <w:proofErr w:type="gramStart"/>
+      <w:r>
+        <w:rPr>
+          <w:lang w:val="en-US"/>
+        </w:rPr>
+        <w:t>the majority of</w:t>
+      </w:r>
+      <w:proofErr w:type="gramEnd"/>
+      <w:r>
+        <w:rPr>
+          <w:lang w:val="en-US"/>
+        </w:rPr>
+        <w:t xml:space="preserve"> people with these diagnoses </w:t>
+      </w:r>
+      <w:r>
+        <w:rPr>
+          <w:lang w:val="en-US"/>
+        </w:rPr>
+        <w:t xml:space="preserve">have very little information given about them, meaning, many of the columns were answered with </w:t>
+      </w:r>
+      <w:proofErr w:type="spellStart"/>
+      <w:r>
+        <w:rPr>
+          <w:lang w:val="en-US"/>
+        </w:rPr>
+        <w:t>NaN</w:t>
+      </w:r>
+      <w:proofErr w:type="spellEnd"/>
+      <w:r>
+        <w:rPr>
+          <w:lang w:val="en-US"/>
+        </w:rPr>
+        <w:t>, including gender. This means that we can’t analyze many factors on these diagnoses.</w:t>
+      </w:r>
+    </w:p>
+    <w:p>
+      <w:pPr>
+        <w:rPr>
+          <w:lang w:val="en-US"/>
+        </w:rPr>
+      </w:pPr>
+    </w:p>
+    <w:p>
+      <w:pPr>
         <w:pStyle w:val="Overskrift2"/>
         <w:rPr>
           <w:lang w:val="en-US"/>
         </w:rPr>
       </w:pPr>
-      <w:bookmarkStart w:id="5" w:name="_Toc222910759"/>
+      <w:bookmarkStart w:id="5" w:name="_Toc222916585"/>
       <w:r>
         <w:rPr>
           <w:lang w:val="en-US"/>
@@ -875,6 +1098,104 @@
         <w:t>Analysis of annotations</w:t>
       </w:r>
       <w:bookmarkEnd w:id="5"/>
+    </w:p>
+    <w:p>
+      <w:pPr>
+        <w:rPr>
+          <w:lang w:val="en-US"/>
+        </w:rPr>
+      </w:pPr>
+      <w:r>
+        <w:rPr>
+          <w:lang w:val="en-US"/>
+        </w:rPr>
+        <w:t>One example of ways we</w:t>
+      </w:r>
+      <w:r>
+        <w:rPr>
+          <w:lang w:val="en-US"/>
+        </w:rPr>
+        <w:t xml:space="preserve"> highly</w:t>
+      </w:r>
+      <w:r>
+        <w:rPr>
+          <w:lang w:val="en-US"/>
+        </w:rPr>
+        <w:t xml:space="preserve"> disagreed, was when you could see the hairline of the person in the pictured, where some of us considered it hairy because there technically was a lot of hair in the picture, where others </w:t>
+      </w:r>
+      <w:r>
+        <w:rPr>
+          <w:lang w:val="en-US"/>
+        </w:rPr>
+        <w:t>considered it not hairy as the hair didn’t cover the mole. An example of this is PAT_224_1340_551, which you can see below.</w:t>
+      </w:r>
+    </w:p>
+    <w:p>
+      <w:pPr>
+        <w:rPr>
+          <w:lang w:val="en-US"/>
+        </w:rPr>
+      </w:pPr>
+      <w:r>
+        <w:rPr>
+          <w:noProof/>
+        </w:rPr>
+        <w:drawing>
+          <wp:inline distT="0" distB="0" distL="0" distR="0" wp14:anchorId="2B0612DF" wp14:editId="262FA229">
+            <wp:extent cx="2392680" cy="2392680"/>
+            <wp:effectExtent l="0" t="0" r="7620" b="7620"/>
+            <wp:docPr id="1092661821" name="Billede 1" descr="Et billede, der indeholder hud, Kød/hud, nærbillede, orgel&#10;&#10;Automatisk genereret beskrivelse"/>
+            <wp:cNvGraphicFramePr>
+              <a:graphicFrameLocks xmlns:a="http://schemas.openxmlformats.org/drawingml/2006/main" noChangeAspect="1"/>
+            </wp:cNvGraphicFramePr>
+            <a:graphic xmlns:a="http://schemas.openxmlformats.org/drawingml/2006/main">
+              <a:graphicData uri="http://schemas.openxmlformats.org/drawingml/2006/picture">
+                <pic:pic xmlns:pic="http://schemas.openxmlformats.org/drawingml/2006/picture">
+                  <pic:nvPicPr>
+                    <pic:cNvPr id="1092661821" name="Billede 1" descr="Et billede, der indeholder hud, Kød/hud, nærbillede, orgel&#10;&#10;Automatisk genereret beskrivelse"/>
+                    <pic:cNvPicPr>
+                      <a:picLocks noChangeAspect="1" noChangeArrowheads="1"/>
+                    </pic:cNvPicPr>
+                  </pic:nvPicPr>
+                  <pic:blipFill>
+                    <a:blip r:embed="rId8" cstate="print">
+                      <a:extLst>
+                        <a:ext uri="{28A0092B-C50C-407E-A947-70E740481C1C}">
+                          <a14:useLocalDpi xmlns:a14="http://schemas.microsoft.com/office/drawing/2010/main" val="0"/>
+                        </a:ext>
+                      </a:extLst>
+                    </a:blip>
+                    <a:srcRect/>
+                    <a:stretch>
+                      <a:fillRect/>
+                    </a:stretch>
+                  </pic:blipFill>
+                  <pic:spPr bwMode="auto">
+                    <a:xfrm>
+                      <a:off x="0" y="0"/>
+                      <a:ext cx="2392680" cy="2392680"/>
+                    </a:xfrm>
+                    <a:prstGeom prst="rect">
+                      <a:avLst/>
+                    </a:prstGeom>
+                    <a:noFill/>
+                    <a:ln>
+                      <a:noFill/>
+                    </a:ln>
+                  </pic:spPr>
+                </pic:pic>
+              </a:graphicData>
+            </a:graphic>
+          </wp:inline>
+        </w:drawing>
+      </w:r>
+    </w:p>
+    <w:p>
+      <w:pPr>
+        <w:rPr>
+          <w:lang w:val="en-US"/>
+        </w:rPr>
+      </w:pPr>
     </w:p>
     <w:sectPr>
       <w:pgSz w:w="11906" w:h="16838"/>
@@ -887,7 +1208,7 @@
 </file>
 
 <file path=word/styles.xml><?xml version="1.0" encoding="utf-8"?>
-<w:styles xmlns:mc="http://schemas.openxmlformats.org/markup-compatibility/2006" xmlns:r="http://schemas.openxmlformats.org/officeDocument/2006/relationships" xmlns:w="http://schemas.openxmlformats.org/wordprocessingml/2006/main" xmlns:w14="http://schemas.microsoft.com/office/word/2010/wordml" xmlns:w15="http://schemas.microsoft.com/office/word/2012/wordml" xmlns:w16cex="http://schemas.microsoft.com/office/word/2018/wordml/cex" xmlns:w16cid="http://schemas.microsoft.com/office/word/2016/wordml/cid" xmlns:w16="http://schemas.microsoft.com/office/word/2018/wordml" xmlns:w16du="http://schemas.microsoft.com/office/word/2023/wordml/word16du" xmlns:w16sdtdh="http://schemas.microsoft.com/office/word/2020/wordml/sdtdatahash" xmlns:w16sdtfl="http://schemas.microsoft.com/office/word/2024/wordml/sdtformatlock" xmlns:w16se="http://schemas.microsoft.com/office/word/2015/wordml/symex" mc:Ignorable="w14 w15 w16se w16cid w16 w16cex w16sdtdh w16sdtfl w16du">
+<w:styles xmlns:mc="http://schemas.openxmlformats.org/markup-compatibility/2006" xmlns:r="http://schemas.openxmlformats.org/officeDocument/2006/relationships" xmlns:w="http://schemas.openxmlformats.org/wordprocessingml/2006/main" xmlns:w14="http://schemas.microsoft.com/office/word/2010/wordml" xmlns:w15="http://schemas.microsoft.com/office/word/2012/wordml" xmlns:w16cex="http://schemas.microsoft.com/office/word/2018/wordml/cex" xmlns:w16cid="http://schemas.microsoft.com/office/word/2016/wordml/cid" xmlns:w16="http://schemas.microsoft.com/office/word/2018/wordml" xmlns:w16du="http://schemas.microsoft.com/office/word/2023/wordml/word16du" xmlns:w16sdtdh="http://schemas.microsoft.com/office/word/2020/wordml/sdtdatahash" xmlns:w16se="http://schemas.microsoft.com/office/word/2015/wordml/symex" mc:Ignorable="w14 w15 w16se w16cid w16 w16cex w16sdtdh w16du">
   <w:docDefaults>
     <w:rPrDefault>
       <w:rPr>

</xml_diff>